<commit_message>
docs: restringe o recebimento REGIN a declaracao do processo
O Swagger oficial passa a exigir um unico JSON, ProcessoDeclaracao. O envelope antigo deixa de ser citado.
</commit_message>
<xml_diff>
--- a/docs/oficios/comunicacao-juceb-api-recebimento-v2.docx
+++ b/docs/oficios/comunicacao-juceb-api-recebimento-v2.docx
@@ -186,17 +186,7 @@
       </w:r>
       <w:r>
         <w:rPr/>
-        <w:t xml:space="preserve"> da API de recebimento. O REGIN continua chamando a URL da Prefeitura, serviço </w:t>
-      </w:r>
-      <w:r>
-        <w:rPr>
-          <w:rStyle w:val="SourceText"/>
-        </w:rPr>
-        <w:t>WsProSol098</w:t>
-      </w:r>
-      <w:r>
-        <w:rPr/>
-        <w:t xml:space="preserve">. Não há token nem header </w:t>
+        <w:t xml:space="preserve"> da API de recebimento. O REGIN chama a URL da Prefeitura. Não há token nem header </w:t>
       </w:r>
       <w:r>
         <w:rPr>
@@ -552,7 +542,7 @@
       </w:pPr>
       <w:r>
         <w:rPr/>
-        <w:t xml:space="preserve">A duplicidade é pelo número do protocolo, não pelo CNPJ. O CNPJ da Prefeitura Municipal de Salvador, usado no envelope, é </w:t>
+        <w:t xml:space="preserve">A duplicidade é pelo número do protocolo, não pelo CNPJ. O CNPJ da Prefeitura Municipal de Salvador é </w:t>
       </w:r>
       <w:r>
         <w:rPr>
@@ -580,7 +570,7 @@
       </w:pPr>
       <w:r>
         <w:rPr/>
-        <w:t>1. Dois corpos aceitos</w:t>
+        <w:t>1. Corpo do POST</w:t>
       </w:r>
     </w:p>
     <w:p>
@@ -603,17 +593,7 @@
       </w:r>
       <w:r>
         <w:rPr/>
-        <w:t xml:space="preserve"> aceita dois JSON. O envelope </w:t>
-      </w:r>
-      <w:r>
-        <w:rPr>
-          <w:rStyle w:val="SourceText"/>
-        </w:rPr>
-        <w:t>EnvioDto</w:t>
-      </w:r>
-      <w:r>
-        <w:rPr/>
-        <w:t xml:space="preserve"> já publicado pela JUCEB (Guia Técnico PSCS e OpenAPI de produção) continua válido. A declaração </w:t>
+        <w:t xml:space="preserve"> recebe um único JSON, a declaração </w:t>
       </w:r>
       <w:r>
         <w:rPr>
@@ -623,7 +603,7 @@
       </w:r>
       <w:r>
         <w:rPr/>
-        <w:t>, versão 2.0.0, é o contrato para abrir a viabilidade com os dados do solicitante, do imóvel, dos CNAEs e das respostas.</w:t>
+        <w:t>, versão 2.0.0. Campos, tipos e exemplos estão na especificação anexa e na página de documentação de cada ambiente.</w:t>
       </w:r>
     </w:p>
     <w:p>
@@ -636,7 +616,7 @@
       </w:pPr>
       <w:r>
         <w:rPr/>
-        <w:t xml:space="preserve">Campos, tipos, exemplos e os dois corpos aceitos estão na especificação anexa e na página de documentação de cada ambiente. O processo é criado quando, além do </w:t>
+        <w:t xml:space="preserve">O processo é criado quando, além do </w:t>
       </w:r>
       <w:r>
         <w:rPr>

</xml_diff>